<commit_message>
refactory: mudancas nas pastas
</commit_message>
<xml_diff>
--- a/ApêndiceC-Análise/4 -VisãoComportamental/PID-NomedoPrimeiroMódulo-v.1.docx
+++ b/ApêndiceC-Análise/4 -VisãoComportamental/PID-NomedoPrimeiroMódulo-v.1.docx
@@ -158,6 +158,16 @@
                 <w:szCs w:val="24"/>
               </w:rPr>
             </w:pPr>
+            <w:proofErr w:type="spellStart"/>
+            <w:r>
+              <w:rPr>
+                <w:rFonts w:ascii="Times New Roman" w:hAnsi="Times New Roman" w:cs="Times New Roman"/>
+                <w:sz w:val="24"/>
+                <w:szCs w:val="24"/>
+              </w:rPr>
+              <w:t>PetLink</w:t>
+            </w:r>
+            <w:proofErr w:type="spellEnd"/>
           </w:p>
         </w:tc>
       </w:tr>
@@ -218,6 +228,14 @@
                 <w:szCs w:val="24"/>
               </w:rPr>
             </w:pPr>
+            <w:r>
+              <w:rPr>
+                <w:rFonts w:ascii="Times New Roman" w:hAnsi="Times New Roman" w:cs="Times New Roman"/>
+                <w:sz w:val="24"/>
+                <w:szCs w:val="24"/>
+              </w:rPr>
+              <w:t>Danilo</w:t>
+            </w:r>
           </w:p>
         </w:tc>
       </w:tr>
@@ -356,6 +374,15 @@
                 <w:szCs w:val="20"/>
               </w:rPr>
             </w:pPr>
+            <w:r>
+              <w:rPr>
+                <w:rFonts w:ascii="Times New Roman" w:eastAsia="Times New Roman" w:hAnsi="Times New Roman" w:cs="Times New Roman"/>
+                <w:color w:val="000000"/>
+                <w:sz w:val="20"/>
+                <w:szCs w:val="20"/>
+              </w:rPr>
+              <w:t>Login de usuário</w:t>
+            </w:r>
           </w:p>
         </w:tc>
       </w:tr>
@@ -422,6 +449,15 @@
                 <w:szCs w:val="20"/>
               </w:rPr>
             </w:pPr>
+            <w:r>
+              <w:rPr>
+                <w:rFonts w:ascii="Times New Roman" w:eastAsia="Times New Roman" w:hAnsi="Times New Roman" w:cs="Times New Roman"/>
+                <w:color w:val="000000"/>
+                <w:sz w:val="20"/>
+                <w:szCs w:val="20"/>
+              </w:rPr>
+              <w:t>Cenário de Login Bem-sucedido</w:t>
+            </w:r>
           </w:p>
         </w:tc>
       </w:tr>
@@ -488,6 +524,15 @@
                 <w:szCs w:val="20"/>
               </w:rPr>
             </w:pPr>
+            <w:r>
+              <w:rPr>
+                <w:rFonts w:ascii="Times New Roman" w:eastAsia="Times New Roman" w:hAnsi="Times New Roman" w:cs="Times New Roman"/>
+                <w:color w:val="000000"/>
+                <w:sz w:val="20"/>
+                <w:szCs w:val="20"/>
+              </w:rPr>
+              <w:t>Usuário</w:t>
+            </w:r>
           </w:p>
         </w:tc>
       </w:tr>
@@ -554,6 +599,15 @@
                 <w:szCs w:val="20"/>
               </w:rPr>
             </w:pPr>
+            <w:r>
+              <w:rPr>
+                <w:rFonts w:ascii="Times New Roman" w:eastAsia="Times New Roman" w:hAnsi="Times New Roman" w:cs="Times New Roman"/>
+                <w:color w:val="000000"/>
+                <w:sz w:val="20"/>
+                <w:szCs w:val="20"/>
+              </w:rPr>
+              <w:t>Ter uma conta cadastrada</w:t>
+            </w:r>
           </w:p>
         </w:tc>
       </w:tr>
@@ -620,6 +674,15 @@
                 <w:szCs w:val="20"/>
               </w:rPr>
             </w:pPr>
+            <w:r>
+              <w:rPr>
+                <w:rFonts w:ascii="Times New Roman" w:eastAsia="Times New Roman" w:hAnsi="Times New Roman" w:cs="Times New Roman"/>
+                <w:color w:val="000000"/>
+                <w:sz w:val="20"/>
+                <w:szCs w:val="20"/>
+              </w:rPr>
+              <w:t>Entrar no site</w:t>
+            </w:r>
           </w:p>
         </w:tc>
       </w:tr>
@@ -726,6 +789,15 @@
               </w:rPr>
               <w:t>1.</w:t>
             </w:r>
+            <w:r>
+              <w:rPr>
+                <w:rFonts w:ascii="Times New Roman" w:eastAsia="Times New Roman" w:hAnsi="Times New Roman" w:cs="Times New Roman"/>
+                <w:color w:val="000000"/>
+                <w:sz w:val="20"/>
+                <w:szCs w:val="20"/>
+              </w:rPr>
+              <w:t>Usuario</w:t>
+            </w:r>
           </w:p>
         </w:tc>
         <w:tc>
@@ -749,54 +821,6 @@
                 <w:szCs w:val="20"/>
               </w:rPr>
             </w:pPr>
-          </w:p>
-        </w:tc>
-      </w:tr>
-      <w:tr>
-        <w:tc>
-          <w:tcPr>
-            <w:tcW w:w="2381" w:type="dxa"/>
-            <w:tcBorders>
-              <w:top w:val="single" w:sz="4" w:space="0" w:color="000000"/>
-              <w:left w:val="single" w:sz="4" w:space="0" w:color="000000"/>
-              <w:bottom w:val="single" w:sz="4" w:space="0" w:color="000000"/>
-              <w:right w:val="single" w:sz="4" w:space="0" w:color="000000"/>
-            </w:tcBorders>
-          </w:tcPr>
-          <w:p>
-            <w:pPr>
-              <w:pStyle w:val="Normal2"/>
-              <w:spacing w:line="276" w:lineRule="auto"/>
-              <w:rPr>
-                <w:rFonts w:ascii="Times New Roman" w:eastAsia="Times New Roman" w:hAnsi="Times New Roman" w:cs="Times New Roman"/>
-                <w:color w:val="000000"/>
-                <w:sz w:val="20"/>
-                <w:szCs w:val="20"/>
-              </w:rPr>
-            </w:pPr>
-          </w:p>
-        </w:tc>
-        <w:tc>
-          <w:tcPr>
-            <w:tcW w:w="6641" w:type="dxa"/>
-            <w:tcBorders>
-              <w:top w:val="single" w:sz="4" w:space="0" w:color="000000"/>
-              <w:left w:val="single" w:sz="4" w:space="0" w:color="000000"/>
-              <w:bottom w:val="single" w:sz="4" w:space="0" w:color="000000"/>
-              <w:right w:val="single" w:sz="4" w:space="0" w:color="000000"/>
-            </w:tcBorders>
-          </w:tcPr>
-          <w:p>
-            <w:pPr>
-              <w:pStyle w:val="Normal2"/>
-              <w:spacing w:line="276" w:lineRule="auto"/>
-              <w:rPr>
-                <w:rFonts w:ascii="Times New Roman" w:eastAsia="Times New Roman" w:hAnsi="Times New Roman" w:cs="Times New Roman"/>
-                <w:color w:val="000000"/>
-                <w:sz w:val="20"/>
-                <w:szCs w:val="20"/>
-              </w:rPr>
-            </w:pPr>
             <w:r>
               <w:rPr>
                 <w:rFonts w:ascii="Times New Roman" w:eastAsia="Times New Roman" w:hAnsi="Times New Roman" w:cs="Times New Roman"/>
@@ -804,7 +828,7 @@
                 <w:sz w:val="20"/>
                 <w:szCs w:val="20"/>
               </w:rPr>
-              <w:t>2.</w:t>
+              <w:t>1. Inserir o Email valido já cadastrado</w:t>
             </w:r>
           </w:p>
         </w:tc>
@@ -854,6 +878,24 @@
                 <w:szCs w:val="20"/>
               </w:rPr>
             </w:pPr>
+            <w:r>
+              <w:rPr>
+                <w:rFonts w:ascii="Times New Roman" w:eastAsia="Times New Roman" w:hAnsi="Times New Roman" w:cs="Times New Roman"/>
+                <w:color w:val="000000"/>
+                <w:sz w:val="20"/>
+                <w:szCs w:val="20"/>
+              </w:rPr>
+              <w:t>2.</w:t>
+            </w:r>
+            <w:r>
+              <w:rPr>
+                <w:rFonts w:ascii="Times New Roman" w:eastAsia="Times New Roman" w:hAnsi="Times New Roman" w:cs="Times New Roman"/>
+                <w:color w:val="000000"/>
+                <w:sz w:val="20"/>
+                <w:szCs w:val="20"/>
+              </w:rPr>
+              <w:t xml:space="preserve"> Inserir a senha valida e correspondente ao Email</w:t>
+            </w:r>
           </w:p>
         </w:tc>
       </w:tr>
@@ -902,6 +944,15 @@
                 <w:szCs w:val="20"/>
               </w:rPr>
             </w:pPr>
+            <w:r>
+              <w:rPr>
+                <w:rFonts w:ascii="Times New Roman" w:eastAsia="Times New Roman" w:hAnsi="Times New Roman" w:cs="Times New Roman"/>
+                <w:color w:val="000000"/>
+                <w:sz w:val="20"/>
+                <w:szCs w:val="20"/>
+              </w:rPr>
+              <w:t>3. Clicar no botão entrar</w:t>
+            </w:r>
           </w:p>
         </w:tc>
       </w:tr>
@@ -950,6 +1001,72 @@
                 <w:szCs w:val="20"/>
               </w:rPr>
             </w:pPr>
+            <w:r>
+              <w:rPr>
+                <w:rFonts w:ascii="Times New Roman" w:eastAsia="Times New Roman" w:hAnsi="Times New Roman" w:cs="Times New Roman"/>
+                <w:color w:val="000000"/>
+                <w:sz w:val="20"/>
+                <w:szCs w:val="20"/>
+              </w:rPr>
+              <w:t>4. logou com sucesso</w:t>
+            </w:r>
+          </w:p>
+        </w:tc>
+      </w:tr>
+      <w:tr>
+        <w:tc>
+          <w:tcPr>
+            <w:tcW w:w="2381" w:type="dxa"/>
+            <w:tcBorders>
+              <w:top w:val="single" w:sz="4" w:space="0" w:color="000000"/>
+              <w:left w:val="single" w:sz="4" w:space="0" w:color="000000"/>
+              <w:bottom w:val="single" w:sz="4" w:space="0" w:color="000000"/>
+              <w:right w:val="single" w:sz="4" w:space="0" w:color="000000"/>
+            </w:tcBorders>
+          </w:tcPr>
+          <w:p>
+            <w:pPr>
+              <w:pStyle w:val="Normal2"/>
+              <w:spacing w:line="276" w:lineRule="auto"/>
+              <w:rPr>
+                <w:rFonts w:ascii="Times New Roman" w:eastAsia="Times New Roman" w:hAnsi="Times New Roman" w:cs="Times New Roman"/>
+                <w:color w:val="000000"/>
+                <w:sz w:val="20"/>
+                <w:szCs w:val="20"/>
+              </w:rPr>
+            </w:pPr>
+          </w:p>
+        </w:tc>
+        <w:tc>
+          <w:tcPr>
+            <w:tcW w:w="6641" w:type="dxa"/>
+            <w:tcBorders>
+              <w:top w:val="single" w:sz="4" w:space="0" w:color="000000"/>
+              <w:left w:val="single" w:sz="4" w:space="0" w:color="000000"/>
+              <w:bottom w:val="single" w:sz="4" w:space="0" w:color="000000"/>
+              <w:right w:val="single" w:sz="4" w:space="0" w:color="000000"/>
+            </w:tcBorders>
+          </w:tcPr>
+          <w:p>
+            <w:pPr>
+              <w:pStyle w:val="Normal2"/>
+              <w:spacing w:line="276" w:lineRule="auto"/>
+              <w:rPr>
+                <w:rFonts w:ascii="Times New Roman" w:eastAsia="Times New Roman" w:hAnsi="Times New Roman" w:cs="Times New Roman"/>
+                <w:color w:val="000000"/>
+                <w:sz w:val="20"/>
+                <w:szCs w:val="20"/>
+              </w:rPr>
+            </w:pPr>
+            <w:r>
+              <w:rPr>
+                <w:rFonts w:ascii="Times New Roman" w:eastAsia="Times New Roman" w:hAnsi="Times New Roman" w:cs="Times New Roman"/>
+                <w:color w:val="000000"/>
+                <w:sz w:val="20"/>
+                <w:szCs w:val="20"/>
+              </w:rPr>
+              <w:t>5. Mostrar Menu inicial</w:t>
+            </w:r>
           </w:p>
         </w:tc>
       </w:tr>

</xml_diff>